<commit_message>
Fase 1 - proyecto Flutter y estructura inicial
</commit_message>
<xml_diff>
--- a/Capturas_Proyecto_ANA.docx
+++ b/Capturas_Proyecto_ANA.docx
@@ -248,6 +248,156 @@
           </wp:inline>
         </w:drawing>
       </w:r>
+    </w:p>
+    <w:p>
+      <w:pPr>
+        <w:ind w:left="708" w:hanging="708"/>
+      </w:pPr>
+      <w:r>
+        <w:rPr>
+          <w:noProof/>
+        </w:rPr>
+        <w:lastRenderedPageBreak/>
+        <w:drawing>
+          <wp:inline distT="0" distB="0" distL="0" distR="0" wp14:anchorId="4962BA8E" wp14:editId="03CD5930">
+            <wp:extent cx="3977640" cy="2169795"/>
+            <wp:effectExtent l="0" t="0" r="3810" b="1905"/>
+            <wp:docPr id="300171885" name="Imagen 1"/>
+            <wp:cNvGraphicFramePr>
+              <a:graphicFrameLocks xmlns:a="http://schemas.openxmlformats.org/drawingml/2006/main" noChangeAspect="1"/>
+            </wp:cNvGraphicFramePr>
+            <a:graphic xmlns:a="http://schemas.openxmlformats.org/drawingml/2006/main">
+              <a:graphicData uri="http://schemas.openxmlformats.org/drawingml/2006/picture">
+                <pic:pic xmlns:pic="http://schemas.openxmlformats.org/drawingml/2006/picture">
+                  <pic:nvPicPr>
+                    <pic:cNvPr id="300171885" name=""/>
+                    <pic:cNvPicPr/>
+                  </pic:nvPicPr>
+                  <pic:blipFill rotWithShape="1">
+                    <a:blip r:embed="rId10"/>
+                    <a:srcRect l="3104" r="23236"/>
+                    <a:stretch>
+                      <a:fillRect/>
+                    </a:stretch>
+                  </pic:blipFill>
+                  <pic:spPr bwMode="auto">
+                    <a:xfrm>
+                      <a:off x="0" y="0"/>
+                      <a:ext cx="3977640" cy="2169795"/>
+                    </a:xfrm>
+                    <a:prstGeom prst="rect">
+                      <a:avLst/>
+                    </a:prstGeom>
+                    <a:ln>
+                      <a:noFill/>
+                    </a:ln>
+                    <a:extLst>
+                      <a:ext uri="{53640926-AAD7-44D8-BBD7-CCE9431645EC}">
+                        <a14:shadowObscured xmlns:a14="http://schemas.microsoft.com/office/drawing/2010/main"/>
+                      </a:ext>
+                    </a:extLst>
+                  </pic:spPr>
+                </pic:pic>
+              </a:graphicData>
+            </a:graphic>
+          </wp:inline>
+        </w:drawing>
+      </w:r>
+    </w:p>
+    <w:p>
+      <w:pPr>
+        <w:ind w:left="708" w:hanging="708"/>
+      </w:pPr>
+      <w:r>
+        <w:drawing>
+          <wp:inline distT="0" distB="0" distL="0" distR="0" wp14:anchorId="17185D7B" wp14:editId="65393915">
+            <wp:extent cx="5400040" cy="4994910"/>
+            <wp:effectExtent l="0" t="0" r="0" b="0"/>
+            <wp:docPr id="549822294" name="Imagen 1"/>
+            <wp:cNvGraphicFramePr>
+              <a:graphicFrameLocks xmlns:a="http://schemas.openxmlformats.org/drawingml/2006/main" noChangeAspect="1"/>
+            </wp:cNvGraphicFramePr>
+            <a:graphic xmlns:a="http://schemas.openxmlformats.org/drawingml/2006/main">
+              <a:graphicData uri="http://schemas.openxmlformats.org/drawingml/2006/picture">
+                <pic:pic xmlns:pic="http://schemas.openxmlformats.org/drawingml/2006/picture">
+                  <pic:nvPicPr>
+                    <pic:cNvPr id="549822294" name=""/>
+                    <pic:cNvPicPr/>
+                  </pic:nvPicPr>
+                  <pic:blipFill>
+                    <a:blip r:embed="rId11"/>
+                    <a:stretch>
+                      <a:fillRect/>
+                    </a:stretch>
+                  </pic:blipFill>
+                  <pic:spPr>
+                    <a:xfrm>
+                      <a:off x="0" y="0"/>
+                      <a:ext cx="5400040" cy="4994910"/>
+                    </a:xfrm>
+                    <a:prstGeom prst="rect">
+                      <a:avLst/>
+                    </a:prstGeom>
+                  </pic:spPr>
+                </pic:pic>
+              </a:graphicData>
+            </a:graphic>
+          </wp:inline>
+        </w:drawing>
+      </w:r>
+    </w:p>
+    <w:p>
+      <w:pPr>
+        <w:ind w:left="708" w:hanging="708"/>
+      </w:pPr>
+      <w:r>
+        <w:lastRenderedPageBreak/>
+        <w:drawing>
+          <wp:inline distT="0" distB="0" distL="0" distR="0" wp14:anchorId="4BD173D9" wp14:editId="0793A257">
+            <wp:extent cx="5400040" cy="4007485"/>
+            <wp:effectExtent l="0" t="0" r="0" b="0"/>
+            <wp:docPr id="510796630" name="Imagen 1"/>
+            <wp:cNvGraphicFramePr>
+              <a:graphicFrameLocks xmlns:a="http://schemas.openxmlformats.org/drawingml/2006/main" noChangeAspect="1"/>
+            </wp:cNvGraphicFramePr>
+            <a:graphic xmlns:a="http://schemas.openxmlformats.org/drawingml/2006/main">
+              <a:graphicData uri="http://schemas.openxmlformats.org/drawingml/2006/picture">
+                <pic:pic xmlns:pic="http://schemas.openxmlformats.org/drawingml/2006/picture">
+                  <pic:nvPicPr>
+                    <pic:cNvPr id="510796630" name=""/>
+                    <pic:cNvPicPr/>
+                  </pic:nvPicPr>
+                  <pic:blipFill>
+                    <a:blip r:embed="rId12"/>
+                    <a:stretch>
+                      <a:fillRect/>
+                    </a:stretch>
+                  </pic:blipFill>
+                  <pic:spPr>
+                    <a:xfrm>
+                      <a:off x="0" y="0"/>
+                      <a:ext cx="5400040" cy="4007485"/>
+                    </a:xfrm>
+                    <a:prstGeom prst="rect">
+                      <a:avLst/>
+                    </a:prstGeom>
+                  </pic:spPr>
+                </pic:pic>
+              </a:graphicData>
+            </a:graphic>
+          </wp:inline>
+        </w:drawing>
+      </w:r>
+    </w:p>
+    <w:p>
+      <w:pPr>
+        <w:ind w:left="708" w:hanging="708"/>
+      </w:pPr>
+    </w:p>
+    <w:p>
+      <w:pPr>
+        <w:ind w:left="708" w:hanging="708"/>
+      </w:pPr>
     </w:p>
     <w:p>
       <w:pPr>

</xml_diff>

<commit_message>
Postman: excluir productos eliminables en la selección
Actualiza el script de prueba postman_collection.json para evitar seleccionar un producto que coincida con la variable de colección idProducto al buscar un artículo con stock > 0. El script ahora lee idProducto y filtra ese producto antes de establecer idProductoVenta, impidiendo así el uso de un producto destinado a ser eliminado.
</commit_message>
<xml_diff>
--- a/Capturas_Proyecto_ANA.docx
+++ b/Capturas_Proyecto_ANA.docx
@@ -4,6 +4,9 @@
   <w:body>
     <w:p>
       <w:r>
+        <w:rPr>
+          <w:noProof/>
+        </w:rPr>
         <w:drawing>
           <wp:inline distT="0" distB="0" distL="0" distR="0" wp14:anchorId="74FAC8BA" wp14:editId="27166F12">
             <wp:extent cx="5400040" cy="3054350"/>
@@ -43,6 +46,9 @@
     </w:p>
     <w:p>
       <w:r>
+        <w:rPr>
+          <w:noProof/>
+        </w:rPr>
         <w:drawing>
           <wp:inline distT="0" distB="0" distL="0" distR="0" wp14:anchorId="2AEBE211" wp14:editId="277B4953">
             <wp:extent cx="5400040" cy="4271645"/>
@@ -85,6 +91,9 @@
         <w:ind w:left="708" w:hanging="708"/>
       </w:pPr>
       <w:r>
+        <w:rPr>
+          <w:noProof/>
+        </w:rPr>
         <w:lastRenderedPageBreak/>
         <w:drawing>
           <wp:inline distT="0" distB="0" distL="0" distR="0" wp14:anchorId="6C8C328B" wp14:editId="3EE7C7D3">
@@ -128,6 +137,9 @@
         <w:ind w:left="708" w:hanging="708"/>
       </w:pPr>
       <w:r>
+        <w:rPr>
+          <w:noProof/>
+        </w:rPr>
         <w:drawing>
           <wp:inline distT="0" distB="0" distL="0" distR="0" wp14:anchorId="1C628321" wp14:editId="5F1170AE">
             <wp:extent cx="5400040" cy="809625"/>
@@ -170,6 +182,9 @@
         <w:ind w:left="708" w:hanging="708"/>
       </w:pPr>
       <w:r>
+        <w:rPr>
+          <w:noProof/>
+        </w:rPr>
         <w:drawing>
           <wp:inline distT="0" distB="0" distL="0" distR="0" wp14:anchorId="6DD779BC" wp14:editId="7E6603AD">
             <wp:extent cx="4086795" cy="609685"/>
@@ -212,6 +227,9 @@
         <w:ind w:left="708" w:hanging="708"/>
       </w:pPr>
       <w:r>
+        <w:rPr>
+          <w:noProof/>
+        </w:rPr>
         <w:drawing>
           <wp:inline distT="0" distB="0" distL="0" distR="0" wp14:anchorId="114FCBC5" wp14:editId="625FB352">
             <wp:extent cx="5400040" cy="1979930"/>
@@ -309,8 +327,11 @@
         <w:ind w:left="708" w:hanging="708"/>
       </w:pPr>
       <w:r>
-        <w:drawing>
-          <wp:inline distT="0" distB="0" distL="0" distR="0" wp14:anchorId="17185D7B" wp14:editId="65393915">
+        <w:rPr>
+          <w:noProof/>
+        </w:rPr>
+        <w:drawing>
+          <wp:inline distT="0" distB="0" distL="0" distR="0" wp14:anchorId="17185D7B" wp14:editId="68554909">
             <wp:extent cx="5400040" cy="4994910"/>
             <wp:effectExtent l="0" t="0" r="0" b="0"/>
             <wp:docPr id="549822294" name="Imagen 1"/>
@@ -351,6 +372,9 @@
         <w:ind w:left="708" w:hanging="708"/>
       </w:pPr>
       <w:r>
+        <w:rPr>
+          <w:noProof/>
+        </w:rPr>
         <w:lastRenderedPageBreak/>
         <w:drawing>
           <wp:inline distT="0" distB="0" distL="0" distR="0" wp14:anchorId="4BD173D9" wp14:editId="0793A257">
@@ -393,26 +417,1040 @@
       <w:pPr>
         <w:ind w:left="708" w:hanging="708"/>
       </w:pPr>
-    </w:p>
-    <w:p>
-      <w:pPr>
-        <w:ind w:left="708" w:hanging="708"/>
-      </w:pPr>
-    </w:p>
-    <w:p>
-      <w:pPr>
-        <w:ind w:left="708" w:hanging="708"/>
-      </w:pPr>
-    </w:p>
-    <w:p>
-      <w:pPr>
-        <w:ind w:left="708" w:hanging="708"/>
-      </w:pPr>
-    </w:p>
-    <w:p>
-      <w:pPr>
-        <w:ind w:left="708" w:hanging="708"/>
-      </w:pPr>
+      <w:r>
+        <w:rPr>
+          <w:noProof/>
+        </w:rPr>
+        <w:drawing>
+          <wp:inline distT="0" distB="0" distL="0" distR="0" wp14:anchorId="7277D7EA" wp14:editId="7AA314AE">
+            <wp:extent cx="5268060" cy="3105583"/>
+            <wp:effectExtent l="0" t="0" r="8890" b="0"/>
+            <wp:docPr id="1283385862" name="Imagen 1"/>
+            <wp:cNvGraphicFramePr>
+              <a:graphicFrameLocks xmlns:a="http://schemas.openxmlformats.org/drawingml/2006/main" noChangeAspect="1"/>
+            </wp:cNvGraphicFramePr>
+            <a:graphic xmlns:a="http://schemas.openxmlformats.org/drawingml/2006/main">
+              <a:graphicData uri="http://schemas.openxmlformats.org/drawingml/2006/picture">
+                <pic:pic xmlns:pic="http://schemas.openxmlformats.org/drawingml/2006/picture">
+                  <pic:nvPicPr>
+                    <pic:cNvPr id="1283385862" name=""/>
+                    <pic:cNvPicPr/>
+                  </pic:nvPicPr>
+                  <pic:blipFill>
+                    <a:blip r:embed="rId13"/>
+                    <a:stretch>
+                      <a:fillRect/>
+                    </a:stretch>
+                  </pic:blipFill>
+                  <pic:spPr>
+                    <a:xfrm>
+                      <a:off x="0" y="0"/>
+                      <a:ext cx="5268060" cy="3105583"/>
+                    </a:xfrm>
+                    <a:prstGeom prst="rect">
+                      <a:avLst/>
+                    </a:prstGeom>
+                  </pic:spPr>
+                </pic:pic>
+              </a:graphicData>
+            </a:graphic>
+          </wp:inline>
+        </w:drawing>
+      </w:r>
+    </w:p>
+    <w:p>
+      <w:pPr>
+        <w:ind w:left="708" w:hanging="708"/>
+      </w:pPr>
+      <w:r>
+        <w:rPr>
+          <w:noProof/>
+        </w:rPr>
+        <w:lastRenderedPageBreak/>
+        <w:drawing>
+          <wp:inline distT="0" distB="0" distL="0" distR="0" wp14:anchorId="5A78EDE8" wp14:editId="695D6937">
+            <wp:extent cx="5400040" cy="2955290"/>
+            <wp:effectExtent l="0" t="0" r="0" b="0"/>
+            <wp:docPr id="1063885453" name="Imagen 1"/>
+            <wp:cNvGraphicFramePr>
+              <a:graphicFrameLocks xmlns:a="http://schemas.openxmlformats.org/drawingml/2006/main" noChangeAspect="1"/>
+            </wp:cNvGraphicFramePr>
+            <a:graphic xmlns:a="http://schemas.openxmlformats.org/drawingml/2006/main">
+              <a:graphicData uri="http://schemas.openxmlformats.org/drawingml/2006/picture">
+                <pic:pic xmlns:pic="http://schemas.openxmlformats.org/drawingml/2006/picture">
+                  <pic:nvPicPr>
+                    <pic:cNvPr id="1063885453" name=""/>
+                    <pic:cNvPicPr/>
+                  </pic:nvPicPr>
+                  <pic:blipFill>
+                    <a:blip r:embed="rId14"/>
+                    <a:stretch>
+                      <a:fillRect/>
+                    </a:stretch>
+                  </pic:blipFill>
+                  <pic:spPr>
+                    <a:xfrm>
+                      <a:off x="0" y="0"/>
+                      <a:ext cx="5400040" cy="2955290"/>
+                    </a:xfrm>
+                    <a:prstGeom prst="rect">
+                      <a:avLst/>
+                    </a:prstGeom>
+                  </pic:spPr>
+                </pic:pic>
+              </a:graphicData>
+            </a:graphic>
+          </wp:inline>
+        </w:drawing>
+      </w:r>
+    </w:p>
+    <w:p>
+      <w:pPr>
+        <w:ind w:left="708" w:hanging="708"/>
+      </w:pPr>
+    </w:p>
+    <w:p>
+      <w:pPr>
+        <w:ind w:left="708" w:hanging="708"/>
+      </w:pPr>
+    </w:p>
+    <w:p>
+      <w:pPr>
+        <w:ind w:left="708" w:hanging="708"/>
+      </w:pPr>
+      <w:r>
+        <w:rPr>
+          <w:noProof/>
+        </w:rPr>
+        <w:drawing>
+          <wp:inline distT="0" distB="0" distL="0" distR="0" wp14:anchorId="1ADC7F0B" wp14:editId="18029A12">
+            <wp:extent cx="4734586" cy="1219370"/>
+            <wp:effectExtent l="0" t="0" r="8890" b="0"/>
+            <wp:docPr id="1697392047" name="Imagen 1"/>
+            <wp:cNvGraphicFramePr>
+              <a:graphicFrameLocks xmlns:a="http://schemas.openxmlformats.org/drawingml/2006/main" noChangeAspect="1"/>
+            </wp:cNvGraphicFramePr>
+            <a:graphic xmlns:a="http://schemas.openxmlformats.org/drawingml/2006/main">
+              <a:graphicData uri="http://schemas.openxmlformats.org/drawingml/2006/picture">
+                <pic:pic xmlns:pic="http://schemas.openxmlformats.org/drawingml/2006/picture">
+                  <pic:nvPicPr>
+                    <pic:cNvPr id="1697392047" name=""/>
+                    <pic:cNvPicPr/>
+                  </pic:nvPicPr>
+                  <pic:blipFill>
+                    <a:blip r:embed="rId15"/>
+                    <a:stretch>
+                      <a:fillRect/>
+                    </a:stretch>
+                  </pic:blipFill>
+                  <pic:spPr>
+                    <a:xfrm>
+                      <a:off x="0" y="0"/>
+                      <a:ext cx="4734586" cy="1219370"/>
+                    </a:xfrm>
+                    <a:prstGeom prst="rect">
+                      <a:avLst/>
+                    </a:prstGeom>
+                  </pic:spPr>
+                </pic:pic>
+              </a:graphicData>
+            </a:graphic>
+          </wp:inline>
+        </w:drawing>
+      </w:r>
+    </w:p>
+    <w:p>
+      <w:pPr>
+        <w:ind w:left="708" w:hanging="708"/>
+      </w:pPr>
+      <w:r>
+        <w:rPr>
+          <w:noProof/>
+        </w:rPr>
+        <w:drawing>
+          <wp:inline distT="0" distB="0" distL="0" distR="0" wp14:anchorId="0B4D742A" wp14:editId="0443B184">
+            <wp:extent cx="5400040" cy="3185795"/>
+            <wp:effectExtent l="0" t="0" r="0" b="0"/>
+            <wp:docPr id="902252975" name="Imagen 1"/>
+            <wp:cNvGraphicFramePr>
+              <a:graphicFrameLocks xmlns:a="http://schemas.openxmlformats.org/drawingml/2006/main" noChangeAspect="1"/>
+            </wp:cNvGraphicFramePr>
+            <a:graphic xmlns:a="http://schemas.openxmlformats.org/drawingml/2006/main">
+              <a:graphicData uri="http://schemas.openxmlformats.org/drawingml/2006/picture">
+                <pic:pic xmlns:pic="http://schemas.openxmlformats.org/drawingml/2006/picture">
+                  <pic:nvPicPr>
+                    <pic:cNvPr id="902252975" name=""/>
+                    <pic:cNvPicPr/>
+                  </pic:nvPicPr>
+                  <pic:blipFill>
+                    <a:blip r:embed="rId16"/>
+                    <a:stretch>
+                      <a:fillRect/>
+                    </a:stretch>
+                  </pic:blipFill>
+                  <pic:spPr>
+                    <a:xfrm>
+                      <a:off x="0" y="0"/>
+                      <a:ext cx="5400040" cy="3185795"/>
+                    </a:xfrm>
+                    <a:prstGeom prst="rect">
+                      <a:avLst/>
+                    </a:prstGeom>
+                  </pic:spPr>
+                </pic:pic>
+              </a:graphicData>
+            </a:graphic>
+          </wp:inline>
+        </w:drawing>
+      </w:r>
+    </w:p>
+    <w:p>
+      <w:pPr>
+        <w:ind w:left="708" w:hanging="708"/>
+      </w:pPr>
+      <w:r>
+        <w:rPr>
+          <w:noProof/>
+        </w:rPr>
+        <w:lastRenderedPageBreak/>
+        <w:drawing>
+          <wp:inline distT="0" distB="0" distL="0" distR="0" wp14:anchorId="54CE2097" wp14:editId="095F1C60">
+            <wp:extent cx="5400040" cy="3179445"/>
+            <wp:effectExtent l="0" t="0" r="0" b="1905"/>
+            <wp:docPr id="2059182845" name="Imagen 1"/>
+            <wp:cNvGraphicFramePr>
+              <a:graphicFrameLocks xmlns:a="http://schemas.openxmlformats.org/drawingml/2006/main" noChangeAspect="1"/>
+            </wp:cNvGraphicFramePr>
+            <a:graphic xmlns:a="http://schemas.openxmlformats.org/drawingml/2006/main">
+              <a:graphicData uri="http://schemas.openxmlformats.org/drawingml/2006/picture">
+                <pic:pic xmlns:pic="http://schemas.openxmlformats.org/drawingml/2006/picture">
+                  <pic:nvPicPr>
+                    <pic:cNvPr id="2059182845" name=""/>
+                    <pic:cNvPicPr/>
+                  </pic:nvPicPr>
+                  <pic:blipFill>
+                    <a:blip r:embed="rId17"/>
+                    <a:stretch>
+                      <a:fillRect/>
+                    </a:stretch>
+                  </pic:blipFill>
+                  <pic:spPr>
+                    <a:xfrm>
+                      <a:off x="0" y="0"/>
+                      <a:ext cx="5400040" cy="3179445"/>
+                    </a:xfrm>
+                    <a:prstGeom prst="rect">
+                      <a:avLst/>
+                    </a:prstGeom>
+                  </pic:spPr>
+                </pic:pic>
+              </a:graphicData>
+            </a:graphic>
+          </wp:inline>
+        </w:drawing>
+      </w:r>
+    </w:p>
+    <w:p>
+      <w:pPr>
+        <w:ind w:left="708" w:hanging="708"/>
+      </w:pPr>
+      <w:r>
+        <w:rPr>
+          <w:noProof/>
+        </w:rPr>
+        <w:drawing>
+          <wp:inline distT="0" distB="0" distL="0" distR="0" wp14:anchorId="23739565" wp14:editId="14B3462C">
+            <wp:extent cx="5400040" cy="3550920"/>
+            <wp:effectExtent l="0" t="0" r="0" b="0"/>
+            <wp:docPr id="1887129406" name="Imagen 1"/>
+            <wp:cNvGraphicFramePr>
+              <a:graphicFrameLocks xmlns:a="http://schemas.openxmlformats.org/drawingml/2006/main" noChangeAspect="1"/>
+            </wp:cNvGraphicFramePr>
+            <a:graphic xmlns:a="http://schemas.openxmlformats.org/drawingml/2006/main">
+              <a:graphicData uri="http://schemas.openxmlformats.org/drawingml/2006/picture">
+                <pic:pic xmlns:pic="http://schemas.openxmlformats.org/drawingml/2006/picture">
+                  <pic:nvPicPr>
+                    <pic:cNvPr id="1887129406" name=""/>
+                    <pic:cNvPicPr/>
+                  </pic:nvPicPr>
+                  <pic:blipFill>
+                    <a:blip r:embed="rId18"/>
+                    <a:stretch>
+                      <a:fillRect/>
+                    </a:stretch>
+                  </pic:blipFill>
+                  <pic:spPr>
+                    <a:xfrm>
+                      <a:off x="0" y="0"/>
+                      <a:ext cx="5400040" cy="3550920"/>
+                    </a:xfrm>
+                    <a:prstGeom prst="rect">
+                      <a:avLst/>
+                    </a:prstGeom>
+                  </pic:spPr>
+                </pic:pic>
+              </a:graphicData>
+            </a:graphic>
+          </wp:inline>
+        </w:drawing>
+      </w:r>
+    </w:p>
+    <w:p>
+      <w:pPr>
+        <w:ind w:left="708" w:hanging="708"/>
+      </w:pPr>
+      <w:r>
+        <w:rPr>
+          <w:noProof/>
+        </w:rPr>
+        <w:lastRenderedPageBreak/>
+        <w:drawing>
+          <wp:inline distT="0" distB="0" distL="0" distR="0" wp14:anchorId="5D169D02" wp14:editId="1BA10380">
+            <wp:extent cx="5400040" cy="4372610"/>
+            <wp:effectExtent l="0" t="0" r="0" b="8890"/>
+            <wp:docPr id="1362131594" name="Imagen 1"/>
+            <wp:cNvGraphicFramePr>
+              <a:graphicFrameLocks xmlns:a="http://schemas.openxmlformats.org/drawingml/2006/main" noChangeAspect="1"/>
+            </wp:cNvGraphicFramePr>
+            <a:graphic xmlns:a="http://schemas.openxmlformats.org/drawingml/2006/main">
+              <a:graphicData uri="http://schemas.openxmlformats.org/drawingml/2006/picture">
+                <pic:pic xmlns:pic="http://schemas.openxmlformats.org/drawingml/2006/picture">
+                  <pic:nvPicPr>
+                    <pic:cNvPr id="1362131594" name=""/>
+                    <pic:cNvPicPr/>
+                  </pic:nvPicPr>
+                  <pic:blipFill>
+                    <a:blip r:embed="rId19"/>
+                    <a:stretch>
+                      <a:fillRect/>
+                    </a:stretch>
+                  </pic:blipFill>
+                  <pic:spPr>
+                    <a:xfrm>
+                      <a:off x="0" y="0"/>
+                      <a:ext cx="5400040" cy="4372610"/>
+                    </a:xfrm>
+                    <a:prstGeom prst="rect">
+                      <a:avLst/>
+                    </a:prstGeom>
+                  </pic:spPr>
+                </pic:pic>
+              </a:graphicData>
+            </a:graphic>
+          </wp:inline>
+        </w:drawing>
+      </w:r>
+    </w:p>
+    <w:p>
+      <w:pPr>
+        <w:ind w:left="708" w:hanging="708"/>
+      </w:pPr>
+      <w:r>
+        <w:rPr>
+          <w:noProof/>
+        </w:rPr>
+        <w:drawing>
+          <wp:inline distT="0" distB="0" distL="0" distR="0" wp14:anchorId="761DEB01" wp14:editId="72E60975">
+            <wp:extent cx="5400040" cy="4232910"/>
+            <wp:effectExtent l="0" t="0" r="0" b="0"/>
+            <wp:docPr id="1662990734" name="Imagen 1"/>
+            <wp:cNvGraphicFramePr>
+              <a:graphicFrameLocks xmlns:a="http://schemas.openxmlformats.org/drawingml/2006/main" noChangeAspect="1"/>
+            </wp:cNvGraphicFramePr>
+            <a:graphic xmlns:a="http://schemas.openxmlformats.org/drawingml/2006/main">
+              <a:graphicData uri="http://schemas.openxmlformats.org/drawingml/2006/picture">
+                <pic:pic xmlns:pic="http://schemas.openxmlformats.org/drawingml/2006/picture">
+                  <pic:nvPicPr>
+                    <pic:cNvPr id="1662990734" name=""/>
+                    <pic:cNvPicPr/>
+                  </pic:nvPicPr>
+                  <pic:blipFill>
+                    <a:blip r:embed="rId20"/>
+                    <a:stretch>
+                      <a:fillRect/>
+                    </a:stretch>
+                  </pic:blipFill>
+                  <pic:spPr>
+                    <a:xfrm>
+                      <a:off x="0" y="0"/>
+                      <a:ext cx="5400040" cy="4232910"/>
+                    </a:xfrm>
+                    <a:prstGeom prst="rect">
+                      <a:avLst/>
+                    </a:prstGeom>
+                  </pic:spPr>
+                </pic:pic>
+              </a:graphicData>
+            </a:graphic>
+          </wp:inline>
+        </w:drawing>
+      </w:r>
+    </w:p>
+    <w:p>
+      <w:pPr>
+        <w:ind w:left="708" w:hanging="708"/>
+      </w:pPr>
+      <w:r>
+        <w:rPr>
+          <w:noProof/>
+        </w:rPr>
+        <w:lastRenderedPageBreak/>
+        <w:drawing>
+          <wp:inline distT="0" distB="0" distL="0" distR="0" wp14:anchorId="6F58AF22" wp14:editId="3843AAF5">
+            <wp:extent cx="4544059" cy="8602275"/>
+            <wp:effectExtent l="0" t="0" r="9525" b="8890"/>
+            <wp:docPr id="1035628132" name="Imagen 1"/>
+            <wp:cNvGraphicFramePr>
+              <a:graphicFrameLocks xmlns:a="http://schemas.openxmlformats.org/drawingml/2006/main" noChangeAspect="1"/>
+            </wp:cNvGraphicFramePr>
+            <a:graphic xmlns:a="http://schemas.openxmlformats.org/drawingml/2006/main">
+              <a:graphicData uri="http://schemas.openxmlformats.org/drawingml/2006/picture">
+                <pic:pic xmlns:pic="http://schemas.openxmlformats.org/drawingml/2006/picture">
+                  <pic:nvPicPr>
+                    <pic:cNvPr id="1035628132" name=""/>
+                    <pic:cNvPicPr/>
+                  </pic:nvPicPr>
+                  <pic:blipFill>
+                    <a:blip r:embed="rId21"/>
+                    <a:stretch>
+                      <a:fillRect/>
+                    </a:stretch>
+                  </pic:blipFill>
+                  <pic:spPr>
+                    <a:xfrm>
+                      <a:off x="0" y="0"/>
+                      <a:ext cx="4544059" cy="8602275"/>
+                    </a:xfrm>
+                    <a:prstGeom prst="rect">
+                      <a:avLst/>
+                    </a:prstGeom>
+                  </pic:spPr>
+                </pic:pic>
+              </a:graphicData>
+            </a:graphic>
+          </wp:inline>
+        </w:drawing>
+      </w:r>
+    </w:p>
+    <w:p>
+      <w:pPr>
+        <w:ind w:left="708" w:hanging="708"/>
+      </w:pPr>
+      <w:r>
+        <w:rPr>
+          <w:noProof/>
+        </w:rPr>
+        <w:lastRenderedPageBreak/>
+        <w:drawing>
+          <wp:inline distT="0" distB="0" distL="0" distR="0" wp14:anchorId="7A15D45D" wp14:editId="0F113498">
+            <wp:extent cx="5400040" cy="5179695"/>
+            <wp:effectExtent l="0" t="0" r="0" b="1905"/>
+            <wp:docPr id="1505363379" name="Imagen 1"/>
+            <wp:cNvGraphicFramePr>
+              <a:graphicFrameLocks xmlns:a="http://schemas.openxmlformats.org/drawingml/2006/main" noChangeAspect="1"/>
+            </wp:cNvGraphicFramePr>
+            <a:graphic xmlns:a="http://schemas.openxmlformats.org/drawingml/2006/main">
+              <a:graphicData uri="http://schemas.openxmlformats.org/drawingml/2006/picture">
+                <pic:pic xmlns:pic="http://schemas.openxmlformats.org/drawingml/2006/picture">
+                  <pic:nvPicPr>
+                    <pic:cNvPr id="1505363379" name=""/>
+                    <pic:cNvPicPr/>
+                  </pic:nvPicPr>
+                  <pic:blipFill>
+                    <a:blip r:embed="rId22"/>
+                    <a:stretch>
+                      <a:fillRect/>
+                    </a:stretch>
+                  </pic:blipFill>
+                  <pic:spPr>
+                    <a:xfrm>
+                      <a:off x="0" y="0"/>
+                      <a:ext cx="5400040" cy="5179695"/>
+                    </a:xfrm>
+                    <a:prstGeom prst="rect">
+                      <a:avLst/>
+                    </a:prstGeom>
+                  </pic:spPr>
+                </pic:pic>
+              </a:graphicData>
+            </a:graphic>
+          </wp:inline>
+        </w:drawing>
+      </w:r>
+    </w:p>
+    <w:p>
+      <w:pPr>
+        <w:ind w:left="708" w:hanging="708"/>
+      </w:pPr>
+      <w:r>
+        <w:rPr>
+          <w:noProof/>
+        </w:rPr>
+        <w:lastRenderedPageBreak/>
+        <w:drawing>
+          <wp:inline distT="0" distB="0" distL="0" distR="0" wp14:anchorId="1557E346" wp14:editId="7F21C314">
+            <wp:extent cx="5400040" cy="5350510"/>
+            <wp:effectExtent l="0" t="0" r="0" b="2540"/>
+            <wp:docPr id="16217107" name="Imagen 1"/>
+            <wp:cNvGraphicFramePr>
+              <a:graphicFrameLocks xmlns:a="http://schemas.openxmlformats.org/drawingml/2006/main" noChangeAspect="1"/>
+            </wp:cNvGraphicFramePr>
+            <a:graphic xmlns:a="http://schemas.openxmlformats.org/drawingml/2006/main">
+              <a:graphicData uri="http://schemas.openxmlformats.org/drawingml/2006/picture">
+                <pic:pic xmlns:pic="http://schemas.openxmlformats.org/drawingml/2006/picture">
+                  <pic:nvPicPr>
+                    <pic:cNvPr id="16217107" name=""/>
+                    <pic:cNvPicPr/>
+                  </pic:nvPicPr>
+                  <pic:blipFill>
+                    <a:blip r:embed="rId23"/>
+                    <a:stretch>
+                      <a:fillRect/>
+                    </a:stretch>
+                  </pic:blipFill>
+                  <pic:spPr>
+                    <a:xfrm>
+                      <a:off x="0" y="0"/>
+                      <a:ext cx="5400040" cy="5350510"/>
+                    </a:xfrm>
+                    <a:prstGeom prst="rect">
+                      <a:avLst/>
+                    </a:prstGeom>
+                  </pic:spPr>
+                </pic:pic>
+              </a:graphicData>
+            </a:graphic>
+          </wp:inline>
+        </w:drawing>
+      </w:r>
+    </w:p>
+    <w:p>
+      <w:pPr>
+        <w:ind w:left="708" w:hanging="708"/>
+      </w:pPr>
+      <w:r>
+        <w:rPr>
+          <w:noProof/>
+        </w:rPr>
+        <w:lastRenderedPageBreak/>
+        <w:drawing>
+          <wp:inline distT="0" distB="0" distL="0" distR="0" wp14:anchorId="639179DB" wp14:editId="36331721">
+            <wp:extent cx="5400040" cy="4781550"/>
+            <wp:effectExtent l="0" t="0" r="0" b="0"/>
+            <wp:docPr id="900520383" name="Imagen 1"/>
+            <wp:cNvGraphicFramePr>
+              <a:graphicFrameLocks xmlns:a="http://schemas.openxmlformats.org/drawingml/2006/main" noChangeAspect="1"/>
+            </wp:cNvGraphicFramePr>
+            <a:graphic xmlns:a="http://schemas.openxmlformats.org/drawingml/2006/main">
+              <a:graphicData uri="http://schemas.openxmlformats.org/drawingml/2006/picture">
+                <pic:pic xmlns:pic="http://schemas.openxmlformats.org/drawingml/2006/picture">
+                  <pic:nvPicPr>
+                    <pic:cNvPr id="900520383" name=""/>
+                    <pic:cNvPicPr/>
+                  </pic:nvPicPr>
+                  <pic:blipFill rotWithShape="1">
+                    <a:blip r:embed="rId24"/>
+                    <a:srcRect t="6553"/>
+                    <a:stretch>
+                      <a:fillRect/>
+                    </a:stretch>
+                  </pic:blipFill>
+                  <pic:spPr bwMode="auto">
+                    <a:xfrm>
+                      <a:off x="0" y="0"/>
+                      <a:ext cx="5400040" cy="4781550"/>
+                    </a:xfrm>
+                    <a:prstGeom prst="rect">
+                      <a:avLst/>
+                    </a:prstGeom>
+                    <a:ln>
+                      <a:noFill/>
+                    </a:ln>
+                    <a:extLst>
+                      <a:ext uri="{53640926-AAD7-44D8-BBD7-CCE9431645EC}">
+                        <a14:shadowObscured xmlns:a14="http://schemas.microsoft.com/office/drawing/2010/main"/>
+                      </a:ext>
+                    </a:extLst>
+                  </pic:spPr>
+                </pic:pic>
+              </a:graphicData>
+            </a:graphic>
+          </wp:inline>
+        </w:drawing>
+      </w:r>
+    </w:p>
+    <w:p>
+      <w:pPr>
+        <w:ind w:left="708" w:hanging="708"/>
+      </w:pPr>
+      <w:r>
+        <w:rPr>
+          <w:noProof/>
+        </w:rPr>
+        <w:lastRenderedPageBreak/>
+        <w:drawing>
+          <wp:inline distT="0" distB="0" distL="0" distR="0" wp14:anchorId="338ABF5B" wp14:editId="6CDBD974">
+            <wp:extent cx="4201111" cy="8878539"/>
+            <wp:effectExtent l="0" t="0" r="9525" b="0"/>
+            <wp:docPr id="1951914899" name="Imagen 1"/>
+            <wp:cNvGraphicFramePr>
+              <a:graphicFrameLocks xmlns:a="http://schemas.openxmlformats.org/drawingml/2006/main" noChangeAspect="1"/>
+            </wp:cNvGraphicFramePr>
+            <a:graphic xmlns:a="http://schemas.openxmlformats.org/drawingml/2006/main">
+              <a:graphicData uri="http://schemas.openxmlformats.org/drawingml/2006/picture">
+                <pic:pic xmlns:pic="http://schemas.openxmlformats.org/drawingml/2006/picture">
+                  <pic:nvPicPr>
+                    <pic:cNvPr id="1951914899" name=""/>
+                    <pic:cNvPicPr/>
+                  </pic:nvPicPr>
+                  <pic:blipFill>
+                    <a:blip r:embed="rId25"/>
+                    <a:stretch>
+                      <a:fillRect/>
+                    </a:stretch>
+                  </pic:blipFill>
+                  <pic:spPr>
+                    <a:xfrm>
+                      <a:off x="0" y="0"/>
+                      <a:ext cx="4201111" cy="8878539"/>
+                    </a:xfrm>
+                    <a:prstGeom prst="rect">
+                      <a:avLst/>
+                    </a:prstGeom>
+                  </pic:spPr>
+                </pic:pic>
+              </a:graphicData>
+            </a:graphic>
+          </wp:inline>
+        </w:drawing>
+      </w:r>
+    </w:p>
+    <w:p>
+      <w:pPr>
+        <w:ind w:left="708" w:hanging="708"/>
+      </w:pPr>
+    </w:p>
+    <w:p>
+      <w:pPr>
+        <w:ind w:left="708" w:hanging="708"/>
+      </w:pPr>
+      <w:r>
+        <w:rPr>
+          <w:noProof/>
+        </w:rPr>
+        <w:drawing>
+          <wp:inline distT="0" distB="0" distL="0" distR="0" wp14:anchorId="3AD09AF6" wp14:editId="048AB730">
+            <wp:extent cx="5400040" cy="3419475"/>
+            <wp:effectExtent l="0" t="0" r="0" b="9525"/>
+            <wp:docPr id="249592525" name="Imagen 1"/>
+            <wp:cNvGraphicFramePr>
+              <a:graphicFrameLocks xmlns:a="http://schemas.openxmlformats.org/drawingml/2006/main" noChangeAspect="1"/>
+            </wp:cNvGraphicFramePr>
+            <a:graphic xmlns:a="http://schemas.openxmlformats.org/drawingml/2006/main">
+              <a:graphicData uri="http://schemas.openxmlformats.org/drawingml/2006/picture">
+                <pic:pic xmlns:pic="http://schemas.openxmlformats.org/drawingml/2006/picture">
+                  <pic:nvPicPr>
+                    <pic:cNvPr id="249592525" name=""/>
+                    <pic:cNvPicPr/>
+                  </pic:nvPicPr>
+                  <pic:blipFill>
+                    <a:blip r:embed="rId26"/>
+                    <a:stretch>
+                      <a:fillRect/>
+                    </a:stretch>
+                  </pic:blipFill>
+                  <pic:spPr>
+                    <a:xfrm>
+                      <a:off x="0" y="0"/>
+                      <a:ext cx="5400040" cy="3419475"/>
+                    </a:xfrm>
+                    <a:prstGeom prst="rect">
+                      <a:avLst/>
+                    </a:prstGeom>
+                  </pic:spPr>
+                </pic:pic>
+              </a:graphicData>
+            </a:graphic>
+          </wp:inline>
+        </w:drawing>
+      </w:r>
+    </w:p>
+    <w:p>
+      <w:pPr>
+        <w:ind w:left="708" w:hanging="708"/>
+      </w:pPr>
+      <w:r>
+        <w:rPr>
+          <w:noProof/>
+        </w:rPr>
+        <w:drawing>
+          <wp:inline distT="0" distB="0" distL="0" distR="0" wp14:anchorId="56B661FB" wp14:editId="2DD9C974">
+            <wp:extent cx="3458058" cy="3781953"/>
+            <wp:effectExtent l="0" t="0" r="9525" b="9525"/>
+            <wp:docPr id="1250675633" name="Imagen 1"/>
+            <wp:cNvGraphicFramePr>
+              <a:graphicFrameLocks xmlns:a="http://schemas.openxmlformats.org/drawingml/2006/main" noChangeAspect="1"/>
+            </wp:cNvGraphicFramePr>
+            <a:graphic xmlns:a="http://schemas.openxmlformats.org/drawingml/2006/main">
+              <a:graphicData uri="http://schemas.openxmlformats.org/drawingml/2006/picture">
+                <pic:pic xmlns:pic="http://schemas.openxmlformats.org/drawingml/2006/picture">
+                  <pic:nvPicPr>
+                    <pic:cNvPr id="1250675633" name=""/>
+                    <pic:cNvPicPr/>
+                  </pic:nvPicPr>
+                  <pic:blipFill>
+                    <a:blip r:embed="rId27"/>
+                    <a:stretch>
+                      <a:fillRect/>
+                    </a:stretch>
+                  </pic:blipFill>
+                  <pic:spPr>
+                    <a:xfrm>
+                      <a:off x="0" y="0"/>
+                      <a:ext cx="3458058" cy="3781953"/>
+                    </a:xfrm>
+                    <a:prstGeom prst="rect">
+                      <a:avLst/>
+                    </a:prstGeom>
+                  </pic:spPr>
+                </pic:pic>
+              </a:graphicData>
+            </a:graphic>
+          </wp:inline>
+        </w:drawing>
+      </w:r>
+    </w:p>
+    <w:p>
+      <w:pPr>
+        <w:ind w:left="708" w:hanging="708"/>
+      </w:pPr>
+    </w:p>
+    <w:p>
+      <w:pPr>
+        <w:ind w:left="708" w:hanging="708"/>
+      </w:pPr>
+    </w:p>
+    <w:p>
+      <w:pPr>
+        <w:ind w:left="708" w:hanging="708"/>
+      </w:pPr>
+    </w:p>
+    <w:p>
+      <w:pPr>
+        <w:ind w:left="708" w:hanging="708"/>
+      </w:pPr>
+      <w:r>
+        <w:rPr>
+          <w:noProof/>
+        </w:rPr>
+        <w:lastRenderedPageBreak/>
+        <w:drawing>
+          <wp:inline distT="0" distB="0" distL="0" distR="0" wp14:anchorId="37ADB064" wp14:editId="03E3B612">
+            <wp:extent cx="5400040" cy="4055110"/>
+            <wp:effectExtent l="0" t="0" r="0" b="2540"/>
+            <wp:docPr id="605070234" name="Imagen 1"/>
+            <wp:cNvGraphicFramePr>
+              <a:graphicFrameLocks xmlns:a="http://schemas.openxmlformats.org/drawingml/2006/main" noChangeAspect="1"/>
+            </wp:cNvGraphicFramePr>
+            <a:graphic xmlns:a="http://schemas.openxmlformats.org/drawingml/2006/main">
+              <a:graphicData uri="http://schemas.openxmlformats.org/drawingml/2006/picture">
+                <pic:pic xmlns:pic="http://schemas.openxmlformats.org/drawingml/2006/picture">
+                  <pic:nvPicPr>
+                    <pic:cNvPr id="605070234" name=""/>
+                    <pic:cNvPicPr/>
+                  </pic:nvPicPr>
+                  <pic:blipFill>
+                    <a:blip r:embed="rId28"/>
+                    <a:stretch>
+                      <a:fillRect/>
+                    </a:stretch>
+                  </pic:blipFill>
+                  <pic:spPr>
+                    <a:xfrm>
+                      <a:off x="0" y="0"/>
+                      <a:ext cx="5400040" cy="4055110"/>
+                    </a:xfrm>
+                    <a:prstGeom prst="rect">
+                      <a:avLst/>
+                    </a:prstGeom>
+                  </pic:spPr>
+                </pic:pic>
+              </a:graphicData>
+            </a:graphic>
+          </wp:inline>
+        </w:drawing>
+      </w:r>
+    </w:p>
+    <w:p>
+      <w:pPr>
+        <w:ind w:left="708" w:hanging="708"/>
+      </w:pPr>
+      <w:r>
+        <w:rPr>
+          <w:noProof/>
+        </w:rPr>
+        <w:drawing>
+          <wp:inline distT="0" distB="0" distL="0" distR="0" wp14:anchorId="24255D40" wp14:editId="39E5400B">
+            <wp:extent cx="5400040" cy="3307715"/>
+            <wp:effectExtent l="0" t="0" r="0" b="6985"/>
+            <wp:docPr id="1066207683" name="Imagen 1"/>
+            <wp:cNvGraphicFramePr>
+              <a:graphicFrameLocks xmlns:a="http://schemas.openxmlformats.org/drawingml/2006/main" noChangeAspect="1"/>
+            </wp:cNvGraphicFramePr>
+            <a:graphic xmlns:a="http://schemas.openxmlformats.org/drawingml/2006/main">
+              <a:graphicData uri="http://schemas.openxmlformats.org/drawingml/2006/picture">
+                <pic:pic xmlns:pic="http://schemas.openxmlformats.org/drawingml/2006/picture">
+                  <pic:nvPicPr>
+                    <pic:cNvPr id="1066207683" name=""/>
+                    <pic:cNvPicPr/>
+                  </pic:nvPicPr>
+                  <pic:blipFill>
+                    <a:blip r:embed="rId29"/>
+                    <a:stretch>
+                      <a:fillRect/>
+                    </a:stretch>
+                  </pic:blipFill>
+                  <pic:spPr>
+                    <a:xfrm>
+                      <a:off x="0" y="0"/>
+                      <a:ext cx="5400040" cy="3307715"/>
+                    </a:xfrm>
+                    <a:prstGeom prst="rect">
+                      <a:avLst/>
+                    </a:prstGeom>
+                  </pic:spPr>
+                </pic:pic>
+              </a:graphicData>
+            </a:graphic>
+          </wp:inline>
+        </w:drawing>
+      </w:r>
+    </w:p>
+    <w:p>
+      <w:pPr>
+        <w:ind w:left="708" w:hanging="708"/>
+      </w:pPr>
+      <w:r>
+        <w:rPr>
+          <w:noProof/>
+        </w:rPr>
+        <w:lastRenderedPageBreak/>
+        <w:drawing>
+          <wp:inline distT="0" distB="0" distL="0" distR="0" wp14:anchorId="553C5BA9" wp14:editId="07954F58">
+            <wp:extent cx="4010585" cy="8745170"/>
+            <wp:effectExtent l="0" t="0" r="9525" b="0"/>
+            <wp:docPr id="1229086357" name="Imagen 1"/>
+            <wp:cNvGraphicFramePr>
+              <a:graphicFrameLocks xmlns:a="http://schemas.openxmlformats.org/drawingml/2006/main" noChangeAspect="1"/>
+            </wp:cNvGraphicFramePr>
+            <a:graphic xmlns:a="http://schemas.openxmlformats.org/drawingml/2006/main">
+              <a:graphicData uri="http://schemas.openxmlformats.org/drawingml/2006/picture">
+                <pic:pic xmlns:pic="http://schemas.openxmlformats.org/drawingml/2006/picture">
+                  <pic:nvPicPr>
+                    <pic:cNvPr id="1229086357" name=""/>
+                    <pic:cNvPicPr/>
+                  </pic:nvPicPr>
+                  <pic:blipFill>
+                    <a:blip r:embed="rId30"/>
+                    <a:stretch>
+                      <a:fillRect/>
+                    </a:stretch>
+                  </pic:blipFill>
+                  <pic:spPr>
+                    <a:xfrm>
+                      <a:off x="0" y="0"/>
+                      <a:ext cx="4010585" cy="8745170"/>
+                    </a:xfrm>
+                    <a:prstGeom prst="rect">
+                      <a:avLst/>
+                    </a:prstGeom>
+                  </pic:spPr>
+                </pic:pic>
+              </a:graphicData>
+            </a:graphic>
+          </wp:inline>
+        </w:drawing>
+      </w:r>
+    </w:p>
+    <w:p>
+      <w:pPr>
+        <w:ind w:left="708" w:hanging="708"/>
+      </w:pPr>
+      <w:r>
+        <w:rPr>
+          <w:noProof/>
+        </w:rPr>
+        <w:lastRenderedPageBreak/>
+        <w:drawing>
+          <wp:inline distT="0" distB="0" distL="0" distR="0" wp14:anchorId="4E1AF29A" wp14:editId="54AD1D29">
+            <wp:extent cx="5400040" cy="3080385"/>
+            <wp:effectExtent l="0" t="0" r="0" b="5715"/>
+            <wp:docPr id="695063379" name="Imagen 1"/>
+            <wp:cNvGraphicFramePr>
+              <a:graphicFrameLocks xmlns:a="http://schemas.openxmlformats.org/drawingml/2006/main" noChangeAspect="1"/>
+            </wp:cNvGraphicFramePr>
+            <a:graphic xmlns:a="http://schemas.openxmlformats.org/drawingml/2006/main">
+              <a:graphicData uri="http://schemas.openxmlformats.org/drawingml/2006/picture">
+                <pic:pic xmlns:pic="http://schemas.openxmlformats.org/drawingml/2006/picture">
+                  <pic:nvPicPr>
+                    <pic:cNvPr id="695063379" name=""/>
+                    <pic:cNvPicPr/>
+                  </pic:nvPicPr>
+                  <pic:blipFill>
+                    <a:blip r:embed="rId31"/>
+                    <a:stretch>
+                      <a:fillRect/>
+                    </a:stretch>
+                  </pic:blipFill>
+                  <pic:spPr>
+                    <a:xfrm>
+                      <a:off x="0" y="0"/>
+                      <a:ext cx="5400040" cy="3080385"/>
+                    </a:xfrm>
+                    <a:prstGeom prst="rect">
+                      <a:avLst/>
+                    </a:prstGeom>
+                  </pic:spPr>
+                </pic:pic>
+              </a:graphicData>
+            </a:graphic>
+          </wp:inline>
+        </w:drawing>
+      </w:r>
+      <w:r>
+        <w:rPr>
+          <w:noProof/>
+        </w:rPr>
+        <w:drawing>
+          <wp:inline distT="0" distB="0" distL="0" distR="0" wp14:anchorId="7A89D503" wp14:editId="423481AC">
+            <wp:extent cx="5400040" cy="2360295"/>
+            <wp:effectExtent l="0" t="0" r="0" b="1905"/>
+            <wp:docPr id="194358839" name="Imagen 1"/>
+            <wp:cNvGraphicFramePr>
+              <a:graphicFrameLocks xmlns:a="http://schemas.openxmlformats.org/drawingml/2006/main" noChangeAspect="1"/>
+            </wp:cNvGraphicFramePr>
+            <a:graphic xmlns:a="http://schemas.openxmlformats.org/drawingml/2006/main">
+              <a:graphicData uri="http://schemas.openxmlformats.org/drawingml/2006/picture">
+                <pic:pic xmlns:pic="http://schemas.openxmlformats.org/drawingml/2006/picture">
+                  <pic:nvPicPr>
+                    <pic:cNvPr id="194358839" name=""/>
+                    <pic:cNvPicPr/>
+                  </pic:nvPicPr>
+                  <pic:blipFill>
+                    <a:blip r:embed="rId32"/>
+                    <a:stretch>
+                      <a:fillRect/>
+                    </a:stretch>
+                  </pic:blipFill>
+                  <pic:spPr>
+                    <a:xfrm>
+                      <a:off x="0" y="0"/>
+                      <a:ext cx="5400040" cy="2360295"/>
+                    </a:xfrm>
+                    <a:prstGeom prst="rect">
+                      <a:avLst/>
+                    </a:prstGeom>
+                  </pic:spPr>
+                </pic:pic>
+              </a:graphicData>
+            </a:graphic>
+          </wp:inline>
+        </w:drawing>
+      </w:r>
+    </w:p>
+    <w:p>
+      <w:pPr>
+        <w:ind w:left="708" w:hanging="708"/>
+      </w:pPr>
+    </w:p>
+    <w:p>
+      <w:pPr>
+        <w:ind w:left="708" w:hanging="708"/>
+      </w:pPr>
+      <w:r>
+        <w:rPr>
+          <w:noProof/>
+        </w:rPr>
+        <w:lastRenderedPageBreak/>
+        <w:drawing>
+          <wp:inline distT="0" distB="0" distL="0" distR="0" wp14:anchorId="1A3521E9" wp14:editId="0362A70A">
+            <wp:extent cx="4167505" cy="8892540"/>
+            <wp:effectExtent l="0" t="0" r="4445" b="3810"/>
+            <wp:docPr id="1298885995" name="Imagen 1"/>
+            <wp:cNvGraphicFramePr>
+              <a:graphicFrameLocks xmlns:a="http://schemas.openxmlformats.org/drawingml/2006/main" noChangeAspect="1"/>
+            </wp:cNvGraphicFramePr>
+            <a:graphic xmlns:a="http://schemas.openxmlformats.org/drawingml/2006/main">
+              <a:graphicData uri="http://schemas.openxmlformats.org/drawingml/2006/picture">
+                <pic:pic xmlns:pic="http://schemas.openxmlformats.org/drawingml/2006/picture">
+                  <pic:nvPicPr>
+                    <pic:cNvPr id="1298885995" name=""/>
+                    <pic:cNvPicPr/>
+                  </pic:nvPicPr>
+                  <pic:blipFill>
+                    <a:blip r:embed="rId33"/>
+                    <a:stretch>
+                      <a:fillRect/>
+                    </a:stretch>
+                  </pic:blipFill>
+                  <pic:spPr>
+                    <a:xfrm>
+                      <a:off x="0" y="0"/>
+                      <a:ext cx="4167505" cy="8892540"/>
+                    </a:xfrm>
+                    <a:prstGeom prst="rect">
+                      <a:avLst/>
+                    </a:prstGeom>
+                  </pic:spPr>
+                </pic:pic>
+              </a:graphicData>
+            </a:graphic>
+          </wp:inline>
+        </w:drawing>
+      </w:r>
+    </w:p>
+    <w:p>
+      <w:pPr>
+        <w:ind w:left="708" w:hanging="708"/>
+      </w:pPr>
+      <w:r>
+        <w:lastRenderedPageBreak/>
+        <w:drawing>
+          <wp:inline distT="0" distB="0" distL="0" distR="0" wp14:anchorId="2F22CEAB" wp14:editId="6734C560">
+            <wp:extent cx="5400040" cy="1077595"/>
+            <wp:effectExtent l="0" t="0" r="0" b="8255"/>
+            <wp:docPr id="1533135317" name="Imagen 1"/>
+            <wp:cNvGraphicFramePr>
+              <a:graphicFrameLocks xmlns:a="http://schemas.openxmlformats.org/drawingml/2006/main" noChangeAspect="1"/>
+            </wp:cNvGraphicFramePr>
+            <a:graphic xmlns:a="http://schemas.openxmlformats.org/drawingml/2006/main">
+              <a:graphicData uri="http://schemas.openxmlformats.org/drawingml/2006/picture">
+                <pic:pic xmlns:pic="http://schemas.openxmlformats.org/drawingml/2006/picture">
+                  <pic:nvPicPr>
+                    <pic:cNvPr id="1533135317" name=""/>
+                    <pic:cNvPicPr/>
+                  </pic:nvPicPr>
+                  <pic:blipFill>
+                    <a:blip r:embed="rId34"/>
+                    <a:stretch>
+                      <a:fillRect/>
+                    </a:stretch>
+                  </pic:blipFill>
+                  <pic:spPr>
+                    <a:xfrm>
+                      <a:off x="0" y="0"/>
+                      <a:ext cx="5400040" cy="1077595"/>
+                    </a:xfrm>
+                    <a:prstGeom prst="rect">
+                      <a:avLst/>
+                    </a:prstGeom>
+                  </pic:spPr>
+                </pic:pic>
+              </a:graphicData>
+            </a:graphic>
+          </wp:inline>
+        </w:drawing>
+      </w:r>
     </w:p>
     <w:sectPr>
       <w:pgSz w:w="11906" w:h="16838"/>

</xml_diff>